<commit_message>
Final Submission: UAS NusaTicket (Backend Golang & SKPL)
</commit_message>
<xml_diff>
--- a/SKPL_NUSATICKET_LatifaKeysha.docx
+++ b/SKPL_NUSATICKET_LatifaKeysha.docx
@@ -2281,7 +2281,11 @@
     <w:p>
       <w:pPr>
         <w:spacing w:line="360" w:lineRule="auto"/>
+        <w:ind w:left="567" w:firstLine="720"/>
         <w:jc w:val="both"/>
+        <w:rPr>
+          <w:rFonts w:ascii="Times New Roman" w:hAnsi="Times New Roman"/>
+        </w:rPr>
       </w:pPr>
       <w:proofErr w:type="spellStart"/>
       <w:r>
@@ -2959,6 +2963,7 @@
     <w:p>
       <w:pPr>
         <w:spacing w:line="360" w:lineRule="auto"/>
+        <w:ind w:left="567"/>
         <w:jc w:val="both"/>
       </w:pPr>
       <w:proofErr w:type="spellStart"/>
@@ -3119,7 +3124,7 @@
     <w:p>
       <w:pPr>
         <w:spacing w:line="360" w:lineRule="auto"/>
-        <w:ind w:left="720" w:hanging="360"/>
+        <w:ind w:left="993" w:hanging="360"/>
         <w:jc w:val="both"/>
       </w:pPr>
       <w:r>
@@ -3232,7 +3237,7 @@
     <w:p>
       <w:pPr>
         <w:spacing w:line="360" w:lineRule="auto"/>
-        <w:ind w:left="720" w:hanging="360"/>
+        <w:ind w:left="993" w:hanging="360"/>
         <w:jc w:val="both"/>
       </w:pPr>
       <w:r>
@@ -3371,7 +3376,7 @@
     <w:p>
       <w:pPr>
         <w:spacing w:line="360" w:lineRule="auto"/>
-        <w:ind w:left="720" w:hanging="360"/>
+        <w:ind w:left="993" w:hanging="360"/>
         <w:jc w:val="both"/>
       </w:pPr>
       <w:r>
@@ -3506,6 +3511,7 @@
     <w:p>
       <w:pPr>
         <w:spacing w:line="360" w:lineRule="auto"/>
+        <w:ind w:left="567"/>
         <w:jc w:val="both"/>
       </w:pPr>
       <w:proofErr w:type="spellStart"/>
@@ -3680,7 +3686,7 @@
     <w:p>
       <w:pPr>
         <w:spacing w:line="360" w:lineRule="auto"/>
-        <w:ind w:left="720" w:hanging="360"/>
+        <w:ind w:left="993" w:hanging="360"/>
         <w:jc w:val="both"/>
       </w:pPr>
       <w:r>
@@ -3793,7 +3799,7 @@
     <w:p>
       <w:pPr>
         <w:spacing w:line="360" w:lineRule="auto"/>
-        <w:ind w:left="720" w:hanging="360"/>
+        <w:ind w:left="993" w:hanging="360"/>
         <w:jc w:val="both"/>
       </w:pPr>
       <w:r>
@@ -3936,7 +3942,7 @@
     <w:p>
       <w:pPr>
         <w:spacing w:line="360" w:lineRule="auto"/>
-        <w:ind w:left="720" w:hanging="360"/>
+        <w:ind w:left="993" w:hanging="360"/>
         <w:jc w:val="both"/>
       </w:pPr>
       <w:r>
@@ -4093,6 +4099,7 @@
     <w:p>
       <w:pPr>
         <w:spacing w:line="360" w:lineRule="auto"/>
+        <w:ind w:left="567"/>
         <w:jc w:val="both"/>
       </w:pPr>
       <w:proofErr w:type="spellStart"/>
@@ -4391,6 +4398,7 @@
           <w:szCs w:val="24"/>
           <w:lang w:val="id-ID"/>
         </w:rPr>
+        <w:lastRenderedPageBreak/>
         <w:tab/>
         <w:t xml:space="preserve">  </w:t>
       </w:r>
@@ -4401,21 +4409,6 @@
         </w:rPr>
         <w:t>Spesifikasi Kebutuhan Perangkat Lunak (SKPL)</w:t>
       </w:r>
-    </w:p>
-    <w:p>
-      <w:pPr>
-        <w:pStyle w:val="BodyText"/>
-        <w:tabs>
-          <w:tab w:val="left" w:pos="1560"/>
-          <w:tab w:val="left" w:pos="1701"/>
-        </w:tabs>
-        <w:spacing w:before="0" w:after="0" w:line="360" w:lineRule="auto"/>
-        <w:ind w:firstLine="720"/>
-        <w:jc w:val="both"/>
-        <w:rPr>
-          <w:szCs w:val="24"/>
-        </w:rPr>
-      </w:pPr>
     </w:p>
     <w:p>
       <w:pPr>
@@ -4438,7 +4431,6 @@
         <w:rPr>
           <w:szCs w:val="24"/>
         </w:rPr>
-        <w:lastRenderedPageBreak/>
         <w:t>IEEE</w:t>
       </w:r>
       <w:r>
@@ -10158,7 +10150,21 @@
               <w:rPr>
                 <w:b/>
               </w:rPr>
-              <w:t xml:space="preserve">Use Case Name : </w:t>
+              <w:t xml:space="preserve">Use Case </w:t>
+            </w:r>
+            <w:proofErr w:type="gramStart"/>
+            <w:r>
+              <w:rPr>
+                <w:b/>
+              </w:rPr>
+              <w:t>Name :</w:t>
+            </w:r>
+            <w:proofErr w:type="gramEnd"/>
+            <w:r>
+              <w:rPr>
+                <w:b/>
+              </w:rPr>
+              <w:t xml:space="preserve"> </w:t>
             </w:r>
             <w:r>
               <w:t>Register User</w:t>
@@ -10173,11 +10179,19 @@
             <w:pPr>
               <w:spacing w:line="360" w:lineRule="auto"/>
             </w:pPr>
+            <w:proofErr w:type="gramStart"/>
             <w:r>
               <w:rPr>
                 <w:b/>
               </w:rPr>
-              <w:t xml:space="preserve">ID : </w:t>
+              <w:t>ID :</w:t>
+            </w:r>
+            <w:proofErr w:type="gramEnd"/>
+            <w:r>
+              <w:rPr>
+                <w:b/>
+              </w:rPr>
+              <w:t xml:space="preserve"> </w:t>
             </w:r>
             <w:r>
               <w:t>UC-01</w:t>
@@ -10192,11 +10206,19 @@
             <w:pPr>
               <w:spacing w:line="360" w:lineRule="auto"/>
             </w:pPr>
+            <w:proofErr w:type="gramStart"/>
             <w:r>
               <w:rPr>
                 <w:b/>
               </w:rPr>
-              <w:t xml:space="preserve">Priority : </w:t>
+              <w:t>Priority :</w:t>
+            </w:r>
+            <w:proofErr w:type="gramEnd"/>
+            <w:r>
+              <w:rPr>
+                <w:b/>
+              </w:rPr>
+              <w:t xml:space="preserve"> </w:t>
             </w:r>
             <w:r>
               <w:t>High</w:t>
@@ -10214,11 +10236,19 @@
             <w:pPr>
               <w:spacing w:line="360" w:lineRule="auto"/>
             </w:pPr>
+            <w:proofErr w:type="gramStart"/>
             <w:r>
               <w:rPr>
                 <w:b/>
               </w:rPr>
-              <w:t xml:space="preserve">Actor : </w:t>
+              <w:t>Actor :</w:t>
+            </w:r>
+            <w:proofErr w:type="gramEnd"/>
+            <w:r>
+              <w:rPr>
+                <w:b/>
+              </w:rPr>
+              <w:t xml:space="preserve"> </w:t>
             </w:r>
             <w:proofErr w:type="spellStart"/>
             <w:r>
@@ -10241,11 +10271,19 @@
             <w:pPr>
               <w:spacing w:line="360" w:lineRule="auto"/>
             </w:pPr>
+            <w:proofErr w:type="gramStart"/>
             <w:r>
               <w:rPr>
                 <w:b/>
               </w:rPr>
-              <w:t xml:space="preserve">Description : </w:t>
+              <w:t>Description :</w:t>
+            </w:r>
+            <w:proofErr w:type="gramEnd"/>
+            <w:r>
+              <w:rPr>
+                <w:b/>
+              </w:rPr>
+              <w:t xml:space="preserve"> </w:t>
             </w:r>
             <w:r>
               <w:t xml:space="preserve">Use case </w:t>
@@ -10359,11 +10397,19 @@
             <w:pPr>
               <w:spacing w:line="360" w:lineRule="auto"/>
             </w:pPr>
+            <w:proofErr w:type="gramStart"/>
             <w:r>
               <w:rPr>
                 <w:b/>
               </w:rPr>
-              <w:t xml:space="preserve">Trigger : </w:t>
+              <w:t>Trigger :</w:t>
+            </w:r>
+            <w:proofErr w:type="gramEnd"/>
+            <w:r>
+              <w:rPr>
+                <w:b/>
+              </w:rPr>
+              <w:t xml:space="preserve"> </w:t>
             </w:r>
             <w:proofErr w:type="spellStart"/>
             <w:r>
@@ -10394,14 +10440,38 @@
             <w:pPr>
               <w:spacing w:line="360" w:lineRule="auto"/>
             </w:pPr>
+            <w:proofErr w:type="gramStart"/>
             <w:r>
               <w:rPr>
                 <w:b/>
               </w:rPr>
-              <w:t xml:space="preserve">Type : </w:t>
-            </w:r>
-            <w:r>
-              <w:t>[ X ] External || [  ]Temporal</w:t>
+              <w:t>Type :</w:t>
+            </w:r>
+            <w:proofErr w:type="gramEnd"/>
+            <w:r>
+              <w:rPr>
+                <w:b/>
+              </w:rPr>
+              <w:t xml:space="preserve"> </w:t>
+            </w:r>
+            <w:r>
+              <w:t xml:space="preserve">[ </w:t>
+            </w:r>
+            <w:proofErr w:type="gramStart"/>
+            <w:r>
+              <w:t>X ]</w:t>
+            </w:r>
+            <w:proofErr w:type="gramEnd"/>
+            <w:r>
+              <w:t xml:space="preserve"> External || </w:t>
+            </w:r>
+            <w:proofErr w:type="gramStart"/>
+            <w:r>
+              <w:t>[  ]</w:t>
+            </w:r>
+            <w:proofErr w:type="gramEnd"/>
+            <w:r>
+              <w:t>Temporal</w:t>
             </w:r>
           </w:p>
         </w:tc>
@@ -10416,11 +10486,19 @@
             <w:pPr>
               <w:spacing w:line="360" w:lineRule="auto"/>
             </w:pPr>
+            <w:proofErr w:type="gramStart"/>
             <w:r>
               <w:rPr>
                 <w:b/>
               </w:rPr>
-              <w:t xml:space="preserve">Preconditions : </w:t>
+              <w:t>Preconditions :</w:t>
+            </w:r>
+            <w:proofErr w:type="gramEnd"/>
+            <w:r>
+              <w:rPr>
+                <w:b/>
+              </w:rPr>
+              <w:t xml:space="preserve"> </w:t>
             </w:r>
             <w:r>
               <w:br/>
@@ -10492,7 +10570,21 @@
                 <w:b/>
               </w:rPr>
               <w:lastRenderedPageBreak/>
-              <w:t xml:space="preserve">Normal Course : </w:t>
+              <w:t xml:space="preserve">Normal </w:t>
+            </w:r>
+            <w:proofErr w:type="gramStart"/>
+            <w:r>
+              <w:rPr>
+                <w:b/>
+              </w:rPr>
+              <w:t>Course :</w:t>
+            </w:r>
+            <w:proofErr w:type="gramEnd"/>
+            <w:r>
+              <w:rPr>
+                <w:b/>
+              </w:rPr>
+              <w:t xml:space="preserve"> </w:t>
             </w:r>
             <w:r>
               <w:br/>
@@ -10660,11 +10752,19 @@
             <w:pPr>
               <w:spacing w:line="360" w:lineRule="auto"/>
             </w:pPr>
+            <w:proofErr w:type="gramStart"/>
             <w:r>
               <w:rPr>
                 <w:b/>
               </w:rPr>
-              <w:t xml:space="preserve">Postconditions : </w:t>
+              <w:t>Postconditions :</w:t>
+            </w:r>
+            <w:proofErr w:type="gramEnd"/>
+            <w:r>
+              <w:rPr>
+                <w:b/>
+              </w:rPr>
+              <w:t xml:space="preserve"> </w:t>
             </w:r>
             <w:r>
               <w:br/>
@@ -10723,11 +10823,19 @@
             <w:pPr>
               <w:spacing w:line="360" w:lineRule="auto"/>
             </w:pPr>
+            <w:proofErr w:type="gramStart"/>
             <w:r>
               <w:rPr>
                 <w:b/>
               </w:rPr>
-              <w:t xml:space="preserve">Exceptions : </w:t>
+              <w:t>Exceptions :</w:t>
+            </w:r>
+            <w:proofErr w:type="gramEnd"/>
+            <w:r>
+              <w:rPr>
+                <w:b/>
+              </w:rPr>
+              <w:t xml:space="preserve"> </w:t>
             </w:r>
             <w:r>
               <w:br/>
@@ -10968,6 +11076,7 @@
       </w:pPr>
       <w:r>
         <w:rPr>
+          <w:noProof/>
           <w:lang w:val="en-ID"/>
         </w:rPr>
         <w:drawing>
@@ -11104,6 +11213,7 @@
       </w:pPr>
       <w:r>
         <w:rPr>
+          <w:noProof/>
           <w:lang w:val="en-ID"/>
         </w:rPr>
         <w:drawing>
@@ -11207,7 +11317,21 @@
               <w:rPr>
                 <w:b/>
               </w:rPr>
-              <w:t xml:space="preserve">Use Case Name : </w:t>
+              <w:t xml:space="preserve">Use Case </w:t>
+            </w:r>
+            <w:proofErr w:type="gramStart"/>
+            <w:r>
+              <w:rPr>
+                <w:b/>
+              </w:rPr>
+              <w:t>Name :</w:t>
+            </w:r>
+            <w:proofErr w:type="gramEnd"/>
+            <w:r>
+              <w:rPr>
+                <w:b/>
+              </w:rPr>
+              <w:t xml:space="preserve"> </w:t>
             </w:r>
             <w:r>
               <w:t>Login</w:t>
@@ -11222,11 +11346,19 @@
             <w:pPr>
               <w:spacing w:line="360" w:lineRule="auto"/>
             </w:pPr>
+            <w:proofErr w:type="gramStart"/>
             <w:r>
               <w:rPr>
                 <w:b/>
               </w:rPr>
-              <w:t xml:space="preserve">ID : </w:t>
+              <w:t>ID :</w:t>
+            </w:r>
+            <w:proofErr w:type="gramEnd"/>
+            <w:r>
+              <w:rPr>
+                <w:b/>
+              </w:rPr>
+              <w:t xml:space="preserve"> </w:t>
             </w:r>
             <w:r>
               <w:t>UC-02</w:t>
@@ -11241,11 +11373,19 @@
             <w:pPr>
               <w:spacing w:line="360" w:lineRule="auto"/>
             </w:pPr>
+            <w:proofErr w:type="gramStart"/>
             <w:r>
               <w:rPr>
                 <w:b/>
               </w:rPr>
-              <w:t xml:space="preserve">Priority : </w:t>
+              <w:t>Priority :</w:t>
+            </w:r>
+            <w:proofErr w:type="gramEnd"/>
+            <w:r>
+              <w:rPr>
+                <w:b/>
+              </w:rPr>
+              <w:t xml:space="preserve"> </w:t>
             </w:r>
             <w:r>
               <w:t>High</w:t>
@@ -11263,11 +11403,19 @@
             <w:pPr>
               <w:spacing w:line="360" w:lineRule="auto"/>
             </w:pPr>
+            <w:proofErr w:type="gramStart"/>
             <w:r>
               <w:rPr>
                 <w:b/>
               </w:rPr>
-              <w:t xml:space="preserve">Actor : </w:t>
+              <w:t>Actor :</w:t>
+            </w:r>
+            <w:proofErr w:type="gramEnd"/>
+            <w:r>
+              <w:rPr>
+                <w:b/>
+              </w:rPr>
+              <w:t xml:space="preserve"> </w:t>
             </w:r>
             <w:r>
               <w:t>User, Admin</w:t>
@@ -11285,11 +11433,19 @@
             <w:pPr>
               <w:spacing w:line="360" w:lineRule="auto"/>
             </w:pPr>
+            <w:proofErr w:type="gramStart"/>
             <w:r>
               <w:rPr>
                 <w:b/>
               </w:rPr>
-              <w:t xml:space="preserve">Description : </w:t>
+              <w:t>Description :</w:t>
+            </w:r>
+            <w:proofErr w:type="gramEnd"/>
+            <w:r>
+              <w:rPr>
+                <w:b/>
+              </w:rPr>
+              <w:t xml:space="preserve"> </w:t>
             </w:r>
             <w:r>
               <w:t xml:space="preserve">Use case </w:t>
@@ -11395,11 +11551,19 @@
             <w:pPr>
               <w:spacing w:line="360" w:lineRule="auto"/>
             </w:pPr>
+            <w:proofErr w:type="gramStart"/>
             <w:r>
               <w:rPr>
                 <w:b/>
               </w:rPr>
-              <w:t xml:space="preserve">Trigger : </w:t>
+              <w:t>Trigger :</w:t>
+            </w:r>
+            <w:proofErr w:type="gramEnd"/>
+            <w:r>
+              <w:rPr>
+                <w:b/>
+              </w:rPr>
+              <w:t xml:space="preserve"> </w:t>
             </w:r>
             <w:r>
               <w:t xml:space="preserve">Aktor </w:t>
@@ -11433,14 +11597,38 @@
             <w:pPr>
               <w:spacing w:line="360" w:lineRule="auto"/>
             </w:pPr>
+            <w:proofErr w:type="gramStart"/>
             <w:r>
               <w:rPr>
                 <w:b/>
               </w:rPr>
-              <w:t xml:space="preserve">Type : </w:t>
-            </w:r>
-            <w:r>
-              <w:t>[ X ] External || [  ]Temporal</w:t>
+              <w:t>Type :</w:t>
+            </w:r>
+            <w:proofErr w:type="gramEnd"/>
+            <w:r>
+              <w:rPr>
+                <w:b/>
+              </w:rPr>
+              <w:t xml:space="preserve"> </w:t>
+            </w:r>
+            <w:r>
+              <w:t xml:space="preserve">[ </w:t>
+            </w:r>
+            <w:proofErr w:type="gramStart"/>
+            <w:r>
+              <w:t>X ]</w:t>
+            </w:r>
+            <w:proofErr w:type="gramEnd"/>
+            <w:r>
+              <w:t xml:space="preserve"> External || </w:t>
+            </w:r>
+            <w:proofErr w:type="gramStart"/>
+            <w:r>
+              <w:t>[  ]</w:t>
+            </w:r>
+            <w:proofErr w:type="gramEnd"/>
+            <w:r>
+              <w:t>Temporal</w:t>
             </w:r>
           </w:p>
         </w:tc>
@@ -11455,11 +11643,19 @@
             <w:pPr>
               <w:spacing w:line="360" w:lineRule="auto"/>
             </w:pPr>
+            <w:proofErr w:type="gramStart"/>
             <w:r>
               <w:rPr>
                 <w:b/>
               </w:rPr>
-              <w:t xml:space="preserve">Preconditions : </w:t>
+              <w:t>Preconditions :</w:t>
+            </w:r>
+            <w:proofErr w:type="gramEnd"/>
+            <w:r>
+              <w:rPr>
+                <w:b/>
+              </w:rPr>
+              <w:t xml:space="preserve"> </w:t>
             </w:r>
             <w:r>
               <w:br/>
@@ -11515,7 +11711,21 @@
                 <w:b/>
               </w:rPr>
               <w:lastRenderedPageBreak/>
-              <w:t xml:space="preserve">Normal Course : </w:t>
+              <w:t xml:space="preserve">Normal </w:t>
+            </w:r>
+            <w:proofErr w:type="gramStart"/>
+            <w:r>
+              <w:rPr>
+                <w:b/>
+              </w:rPr>
+              <w:t>Course :</w:t>
+            </w:r>
+            <w:proofErr w:type="gramEnd"/>
+            <w:r>
+              <w:rPr>
+                <w:b/>
+              </w:rPr>
+              <w:t xml:space="preserve"> </w:t>
             </w:r>
             <w:r>
               <w:br/>
@@ -11699,11 +11909,19 @@
             <w:pPr>
               <w:spacing w:line="360" w:lineRule="auto"/>
             </w:pPr>
+            <w:proofErr w:type="gramStart"/>
             <w:r>
               <w:rPr>
                 <w:b/>
               </w:rPr>
-              <w:t xml:space="preserve">Postconditions : </w:t>
+              <w:t>Postconditions :</w:t>
+            </w:r>
+            <w:proofErr w:type="gramEnd"/>
+            <w:r>
+              <w:rPr>
+                <w:b/>
+              </w:rPr>
+              <w:t xml:space="preserve"> </w:t>
             </w:r>
             <w:r>
               <w:br/>
@@ -11762,11 +11980,19 @@
             <w:pPr>
               <w:spacing w:line="360" w:lineRule="auto"/>
             </w:pPr>
+            <w:proofErr w:type="gramStart"/>
             <w:r>
               <w:rPr>
                 <w:b/>
               </w:rPr>
-              <w:t xml:space="preserve">Exceptions : </w:t>
+              <w:t>Exceptions :</w:t>
+            </w:r>
+            <w:proofErr w:type="gramEnd"/>
+            <w:r>
+              <w:rPr>
+                <w:b/>
+              </w:rPr>
+              <w:t xml:space="preserve"> </w:t>
             </w:r>
             <w:r>
               <w:br/>
@@ -11969,6 +12195,7 @@
       </w:pPr>
       <w:r>
         <w:rPr>
+          <w:noProof/>
           <w:lang w:val="en-ID"/>
         </w:rPr>
         <w:drawing>
@@ -12100,6 +12327,7 @@
       </w:pPr>
       <w:r>
         <w:rPr>
+          <w:noProof/>
           <w:lang w:val="en-ID"/>
         </w:rPr>
         <w:drawing>
@@ -12232,7 +12460,21 @@
               <w:rPr>
                 <w:b/>
               </w:rPr>
-              <w:t xml:space="preserve">Use Case Name : </w:t>
+              <w:t xml:space="preserve">Use Case </w:t>
+            </w:r>
+            <w:proofErr w:type="gramStart"/>
+            <w:r>
+              <w:rPr>
+                <w:b/>
+              </w:rPr>
+              <w:t>Name :</w:t>
+            </w:r>
+            <w:proofErr w:type="gramEnd"/>
+            <w:r>
+              <w:rPr>
+                <w:b/>
+              </w:rPr>
+              <w:t xml:space="preserve"> </w:t>
             </w:r>
             <w:proofErr w:type="spellStart"/>
             <w:r>
@@ -12260,11 +12502,19 @@
             <w:pPr>
               <w:spacing w:line="360" w:lineRule="auto"/>
             </w:pPr>
+            <w:proofErr w:type="gramStart"/>
             <w:r>
               <w:rPr>
                 <w:b/>
               </w:rPr>
-              <w:t xml:space="preserve">ID : </w:t>
+              <w:t>ID :</w:t>
+            </w:r>
+            <w:proofErr w:type="gramEnd"/>
+            <w:r>
+              <w:rPr>
+                <w:b/>
+              </w:rPr>
+              <w:t xml:space="preserve"> </w:t>
             </w:r>
             <w:r>
               <w:t>UC-03</w:t>
@@ -12279,11 +12529,19 @@
             <w:pPr>
               <w:spacing w:line="360" w:lineRule="auto"/>
             </w:pPr>
+            <w:proofErr w:type="gramStart"/>
             <w:r>
               <w:rPr>
                 <w:b/>
               </w:rPr>
-              <w:t xml:space="preserve">Priority : </w:t>
+              <w:t>Priority :</w:t>
+            </w:r>
+            <w:proofErr w:type="gramEnd"/>
+            <w:r>
+              <w:rPr>
+                <w:b/>
+              </w:rPr>
+              <w:t xml:space="preserve"> </w:t>
             </w:r>
             <w:r>
               <w:t>High</w:t>
@@ -12301,11 +12559,19 @@
             <w:pPr>
               <w:spacing w:line="360" w:lineRule="auto"/>
             </w:pPr>
+            <w:proofErr w:type="gramStart"/>
             <w:r>
               <w:rPr>
                 <w:b/>
               </w:rPr>
-              <w:t xml:space="preserve">Actor : </w:t>
+              <w:t>Actor :</w:t>
+            </w:r>
+            <w:proofErr w:type="gramEnd"/>
+            <w:r>
+              <w:rPr>
+                <w:b/>
+              </w:rPr>
+              <w:t xml:space="preserve"> </w:t>
             </w:r>
             <w:proofErr w:type="spellStart"/>
             <w:r>
@@ -12328,11 +12594,19 @@
             <w:pPr>
               <w:spacing w:line="360" w:lineRule="auto"/>
             </w:pPr>
+            <w:proofErr w:type="gramStart"/>
             <w:r>
               <w:rPr>
                 <w:b/>
               </w:rPr>
-              <w:t xml:space="preserve">Description : </w:t>
+              <w:t>Description :</w:t>
+            </w:r>
+            <w:proofErr w:type="gramEnd"/>
+            <w:r>
+              <w:rPr>
+                <w:b/>
+              </w:rPr>
+              <w:t xml:space="preserve"> </w:t>
             </w:r>
             <w:r>
               <w:t xml:space="preserve">Use case </w:t>
@@ -12414,11 +12688,19 @@
             <w:pPr>
               <w:spacing w:line="360" w:lineRule="auto"/>
             </w:pPr>
+            <w:proofErr w:type="gramStart"/>
             <w:r>
               <w:rPr>
                 <w:b/>
               </w:rPr>
-              <w:t xml:space="preserve">Trigger : </w:t>
+              <w:t>Trigger :</w:t>
+            </w:r>
+            <w:proofErr w:type="gramEnd"/>
+            <w:r>
+              <w:rPr>
+                <w:b/>
+              </w:rPr>
+              <w:t xml:space="preserve"> </w:t>
             </w:r>
             <w:proofErr w:type="spellStart"/>
             <w:r>
@@ -12473,14 +12755,38 @@
             <w:pPr>
               <w:spacing w:line="360" w:lineRule="auto"/>
             </w:pPr>
+            <w:proofErr w:type="gramStart"/>
             <w:r>
               <w:rPr>
                 <w:b/>
               </w:rPr>
-              <w:t xml:space="preserve">Type : </w:t>
-            </w:r>
-            <w:r>
-              <w:t>[ X ] External || [  ]Temporal</w:t>
+              <w:t>Type :</w:t>
+            </w:r>
+            <w:proofErr w:type="gramEnd"/>
+            <w:r>
+              <w:rPr>
+                <w:b/>
+              </w:rPr>
+              <w:t xml:space="preserve"> </w:t>
+            </w:r>
+            <w:r>
+              <w:t xml:space="preserve">[ </w:t>
+            </w:r>
+            <w:proofErr w:type="gramStart"/>
+            <w:r>
+              <w:t>X ]</w:t>
+            </w:r>
+            <w:proofErr w:type="gramEnd"/>
+            <w:r>
+              <w:t xml:space="preserve"> External || </w:t>
+            </w:r>
+            <w:proofErr w:type="gramStart"/>
+            <w:r>
+              <w:t>[  ]</w:t>
+            </w:r>
+            <w:proofErr w:type="gramEnd"/>
+            <w:r>
+              <w:t>Temporal</w:t>
             </w:r>
           </w:p>
         </w:tc>
@@ -12495,11 +12801,19 @@
             <w:pPr>
               <w:spacing w:line="360" w:lineRule="auto"/>
             </w:pPr>
+            <w:proofErr w:type="gramStart"/>
             <w:r>
               <w:rPr>
                 <w:b/>
               </w:rPr>
-              <w:t xml:space="preserve">Preconditions : </w:t>
+              <w:t>Preconditions :</w:t>
+            </w:r>
+            <w:proofErr w:type="gramEnd"/>
+            <w:r>
+              <w:rPr>
+                <w:b/>
+              </w:rPr>
+              <w:t xml:space="preserve"> </w:t>
             </w:r>
             <w:r>
               <w:br/>
@@ -12562,7 +12876,21 @@
               <w:rPr>
                 <w:b/>
               </w:rPr>
-              <w:t xml:space="preserve">Normal Course : </w:t>
+              <w:t xml:space="preserve">Normal </w:t>
+            </w:r>
+            <w:proofErr w:type="gramStart"/>
+            <w:r>
+              <w:rPr>
+                <w:b/>
+              </w:rPr>
+              <w:t>Course :</w:t>
+            </w:r>
+            <w:proofErr w:type="gramEnd"/>
+            <w:r>
+              <w:rPr>
+                <w:b/>
+              </w:rPr>
+              <w:t xml:space="preserve"> </w:t>
             </w:r>
             <w:r>
               <w:br/>
@@ -12734,12 +13062,20 @@
             <w:pPr>
               <w:spacing w:line="360" w:lineRule="auto"/>
             </w:pPr>
+            <w:proofErr w:type="gramStart"/>
             <w:r>
               <w:rPr>
                 <w:b/>
               </w:rPr>
               <w:lastRenderedPageBreak/>
-              <w:t xml:space="preserve">Postconditions : </w:t>
+              <w:t>Postconditions :</w:t>
+            </w:r>
+            <w:proofErr w:type="gramEnd"/>
+            <w:r>
+              <w:rPr>
+                <w:b/>
+              </w:rPr>
+              <w:t xml:space="preserve"> </w:t>
             </w:r>
             <w:r>
               <w:br/>
@@ -12790,11 +13126,19 @@
             <w:pPr>
               <w:spacing w:line="360" w:lineRule="auto"/>
             </w:pPr>
+            <w:proofErr w:type="gramStart"/>
             <w:r>
               <w:rPr>
                 <w:b/>
               </w:rPr>
-              <w:t xml:space="preserve">Exceptions : </w:t>
+              <w:t>Exceptions :</w:t>
+            </w:r>
+            <w:proofErr w:type="gramEnd"/>
+            <w:r>
+              <w:rPr>
+                <w:b/>
+              </w:rPr>
+              <w:t xml:space="preserve"> </w:t>
             </w:r>
             <w:r>
               <w:br/>
@@ -13052,6 +13396,7 @@
       </w:pPr>
       <w:r>
         <w:rPr>
+          <w:noProof/>
           <w:lang w:val="en-ID"/>
         </w:rPr>
         <w:drawing>
@@ -13220,6 +13565,7 @@
       </w:pPr>
       <w:r>
         <w:rPr>
+          <w:noProof/>
           <w:lang w:val="en-ID"/>
         </w:rPr>
         <w:drawing>
@@ -13339,7 +13685,21 @@
               <w:rPr>
                 <w:b/>
               </w:rPr>
-              <w:t xml:space="preserve">Use Case Name : </w:t>
+              <w:t xml:space="preserve">Use Case </w:t>
+            </w:r>
+            <w:proofErr w:type="gramStart"/>
+            <w:r>
+              <w:rPr>
+                <w:b/>
+              </w:rPr>
+              <w:t>Name :</w:t>
+            </w:r>
+            <w:proofErr w:type="gramEnd"/>
+            <w:r>
+              <w:rPr>
+                <w:b/>
+              </w:rPr>
+              <w:t xml:space="preserve"> </w:t>
             </w:r>
             <w:r>
               <w:t xml:space="preserve">Beli </w:t>
@@ -13359,11 +13719,19 @@
             <w:pPr>
               <w:spacing w:line="360" w:lineRule="auto"/>
             </w:pPr>
+            <w:proofErr w:type="gramStart"/>
             <w:r>
               <w:rPr>
                 <w:b/>
               </w:rPr>
-              <w:t xml:space="preserve">ID : </w:t>
+              <w:t>ID :</w:t>
+            </w:r>
+            <w:proofErr w:type="gramEnd"/>
+            <w:r>
+              <w:rPr>
+                <w:b/>
+              </w:rPr>
+              <w:t xml:space="preserve"> </w:t>
             </w:r>
             <w:r>
               <w:t>UC-04</w:t>
@@ -13378,11 +13746,19 @@
             <w:pPr>
               <w:spacing w:line="360" w:lineRule="auto"/>
             </w:pPr>
+            <w:proofErr w:type="gramStart"/>
             <w:r>
               <w:rPr>
                 <w:b/>
               </w:rPr>
-              <w:t xml:space="preserve">Priority : </w:t>
+              <w:t>Priority :</w:t>
+            </w:r>
+            <w:proofErr w:type="gramEnd"/>
+            <w:r>
+              <w:rPr>
+                <w:b/>
+              </w:rPr>
+              <w:t xml:space="preserve"> </w:t>
             </w:r>
             <w:r>
               <w:t>High</w:t>
@@ -13400,11 +13776,19 @@
             <w:pPr>
               <w:spacing w:line="360" w:lineRule="auto"/>
             </w:pPr>
+            <w:proofErr w:type="gramStart"/>
             <w:r>
               <w:rPr>
                 <w:b/>
               </w:rPr>
-              <w:t xml:space="preserve">Actor : </w:t>
+              <w:t>Actor :</w:t>
+            </w:r>
+            <w:proofErr w:type="gramEnd"/>
+            <w:r>
+              <w:rPr>
+                <w:b/>
+              </w:rPr>
+              <w:t xml:space="preserve"> </w:t>
             </w:r>
             <w:r>
               <w:t>User</w:t>
@@ -13422,11 +13806,19 @@
             <w:pPr>
               <w:spacing w:line="360" w:lineRule="auto"/>
             </w:pPr>
+            <w:proofErr w:type="gramStart"/>
             <w:r>
               <w:rPr>
                 <w:b/>
               </w:rPr>
-              <w:t xml:space="preserve">Description : </w:t>
+              <w:t>Description :</w:t>
+            </w:r>
+            <w:proofErr w:type="gramEnd"/>
+            <w:r>
+              <w:rPr>
+                <w:b/>
+              </w:rPr>
+              <w:t xml:space="preserve"> </w:t>
             </w:r>
             <w:r>
               <w:t xml:space="preserve">Use case </w:t>
@@ -13500,11 +13892,19 @@
             <w:pPr>
               <w:spacing w:line="360" w:lineRule="auto"/>
             </w:pPr>
+            <w:proofErr w:type="gramStart"/>
             <w:r>
               <w:rPr>
                 <w:b/>
               </w:rPr>
-              <w:t xml:space="preserve">Trigger : </w:t>
+              <w:t>Trigger :</w:t>
+            </w:r>
+            <w:proofErr w:type="gramEnd"/>
+            <w:r>
+              <w:rPr>
+                <w:b/>
+              </w:rPr>
+              <w:t xml:space="preserve"> </w:t>
             </w:r>
             <w:r>
               <w:t xml:space="preserve">User </w:t>
@@ -13554,14 +13954,38 @@
             <w:pPr>
               <w:spacing w:line="360" w:lineRule="auto"/>
             </w:pPr>
+            <w:proofErr w:type="gramStart"/>
             <w:r>
               <w:rPr>
                 <w:b/>
               </w:rPr>
-              <w:t xml:space="preserve">Type : </w:t>
-            </w:r>
-            <w:r>
-              <w:t>[ X ] External || [  ]Temporal</w:t>
+              <w:t>Type :</w:t>
+            </w:r>
+            <w:proofErr w:type="gramEnd"/>
+            <w:r>
+              <w:rPr>
+                <w:b/>
+              </w:rPr>
+              <w:t xml:space="preserve"> </w:t>
+            </w:r>
+            <w:r>
+              <w:t xml:space="preserve">[ </w:t>
+            </w:r>
+            <w:proofErr w:type="gramStart"/>
+            <w:r>
+              <w:t>X ]</w:t>
+            </w:r>
+            <w:proofErr w:type="gramEnd"/>
+            <w:r>
+              <w:t xml:space="preserve"> External || </w:t>
+            </w:r>
+            <w:proofErr w:type="gramStart"/>
+            <w:r>
+              <w:t>[  ]</w:t>
+            </w:r>
+            <w:proofErr w:type="gramEnd"/>
+            <w:r>
+              <w:t>Temporal</w:t>
             </w:r>
           </w:p>
         </w:tc>
@@ -13576,11 +14000,19 @@
             <w:pPr>
               <w:spacing w:line="360" w:lineRule="auto"/>
             </w:pPr>
+            <w:proofErr w:type="gramStart"/>
             <w:r>
               <w:rPr>
                 <w:b/>
               </w:rPr>
-              <w:t xml:space="preserve">Preconditions : </w:t>
+              <w:t>Preconditions :</w:t>
+            </w:r>
+            <w:proofErr w:type="gramEnd"/>
+            <w:r>
+              <w:rPr>
+                <w:b/>
+              </w:rPr>
+              <w:t xml:space="preserve"> </w:t>
             </w:r>
             <w:r>
               <w:br/>
@@ -13644,7 +14076,21 @@
                 <w:b/>
               </w:rPr>
               <w:lastRenderedPageBreak/>
-              <w:t xml:space="preserve">Normal Course : </w:t>
+              <w:t xml:space="preserve">Normal </w:t>
+            </w:r>
+            <w:proofErr w:type="gramStart"/>
+            <w:r>
+              <w:rPr>
+                <w:b/>
+              </w:rPr>
+              <w:t>Course :</w:t>
+            </w:r>
+            <w:proofErr w:type="gramEnd"/>
+            <w:r>
+              <w:rPr>
+                <w:b/>
+              </w:rPr>
+              <w:t xml:space="preserve"> </w:t>
             </w:r>
             <w:r>
               <w:br/>
@@ -13876,11 +14322,19 @@
             <w:pPr>
               <w:spacing w:line="360" w:lineRule="auto"/>
             </w:pPr>
+            <w:proofErr w:type="gramStart"/>
             <w:r>
               <w:rPr>
                 <w:b/>
               </w:rPr>
-              <w:t xml:space="preserve">Postconditions : </w:t>
+              <w:t>Postconditions :</w:t>
+            </w:r>
+            <w:proofErr w:type="gramEnd"/>
+            <w:r>
+              <w:rPr>
+                <w:b/>
+              </w:rPr>
+              <w:t xml:space="preserve"> </w:t>
             </w:r>
             <w:r>
               <w:br/>
@@ -13947,11 +14401,19 @@
             <w:pPr>
               <w:spacing w:line="360" w:lineRule="auto"/>
             </w:pPr>
+            <w:proofErr w:type="gramStart"/>
             <w:r>
               <w:rPr>
                 <w:b/>
               </w:rPr>
-              <w:t xml:space="preserve">Exceptions : </w:t>
+              <w:t>Exceptions :</w:t>
+            </w:r>
+            <w:proofErr w:type="gramEnd"/>
+            <w:r>
+              <w:rPr>
+                <w:b/>
+              </w:rPr>
+              <w:t xml:space="preserve"> </w:t>
             </w:r>
             <w:r>
               <w:br/>
@@ -14217,6 +14679,7 @@
       </w:pPr>
       <w:r>
         <w:rPr>
+          <w:noProof/>
           <w:lang w:val="en-ID"/>
         </w:rPr>
         <w:drawing>
@@ -14361,6 +14824,7 @@
       </w:pPr>
       <w:r>
         <w:rPr>
+          <w:noProof/>
           <w:lang w:val="en-ID"/>
         </w:rPr>
         <w:drawing>
@@ -14493,7 +14957,21 @@
               <w:rPr>
                 <w:b/>
               </w:rPr>
-              <w:t xml:space="preserve">Use Case Name : </w:t>
+              <w:t xml:space="preserve">Use Case </w:t>
+            </w:r>
+            <w:proofErr w:type="gramStart"/>
+            <w:r>
+              <w:rPr>
+                <w:b/>
+              </w:rPr>
+              <w:t>Name :</w:t>
+            </w:r>
+            <w:proofErr w:type="gramEnd"/>
+            <w:r>
+              <w:rPr>
+                <w:b/>
+              </w:rPr>
+              <w:t xml:space="preserve"> </w:t>
             </w:r>
             <w:proofErr w:type="spellStart"/>
             <w:r>
@@ -14521,11 +14999,19 @@
             <w:pPr>
               <w:spacing w:line="360" w:lineRule="auto"/>
             </w:pPr>
+            <w:proofErr w:type="gramStart"/>
             <w:r>
               <w:rPr>
                 <w:b/>
               </w:rPr>
-              <w:t xml:space="preserve">ID : </w:t>
+              <w:t>ID :</w:t>
+            </w:r>
+            <w:proofErr w:type="gramEnd"/>
+            <w:r>
+              <w:rPr>
+                <w:b/>
+              </w:rPr>
+              <w:t xml:space="preserve"> </w:t>
             </w:r>
             <w:r>
               <w:t>UC-05</w:t>
@@ -14540,11 +15026,19 @@
             <w:pPr>
               <w:spacing w:line="360" w:lineRule="auto"/>
             </w:pPr>
+            <w:proofErr w:type="gramStart"/>
             <w:r>
               <w:rPr>
                 <w:b/>
               </w:rPr>
-              <w:t xml:space="preserve">Priority : </w:t>
+              <w:t>Priority :</w:t>
+            </w:r>
+            <w:proofErr w:type="gramEnd"/>
+            <w:r>
+              <w:rPr>
+                <w:b/>
+              </w:rPr>
+              <w:t xml:space="preserve"> </w:t>
             </w:r>
             <w:r>
               <w:t>High</w:t>
@@ -14562,11 +15056,19 @@
             <w:pPr>
               <w:spacing w:line="360" w:lineRule="auto"/>
             </w:pPr>
+            <w:proofErr w:type="gramStart"/>
             <w:r>
               <w:rPr>
                 <w:b/>
               </w:rPr>
-              <w:t xml:space="preserve">Actor : </w:t>
+              <w:t>Actor :</w:t>
+            </w:r>
+            <w:proofErr w:type="gramEnd"/>
+            <w:r>
+              <w:rPr>
+                <w:b/>
+              </w:rPr>
+              <w:t xml:space="preserve"> </w:t>
             </w:r>
             <w:r>
               <w:t>Admin</w:t>
@@ -14584,11 +15086,19 @@
             <w:pPr>
               <w:spacing w:line="360" w:lineRule="auto"/>
             </w:pPr>
+            <w:proofErr w:type="gramStart"/>
             <w:r>
               <w:rPr>
                 <w:b/>
               </w:rPr>
-              <w:t xml:space="preserve">Description : </w:t>
+              <w:t>Description :</w:t>
+            </w:r>
+            <w:proofErr w:type="gramEnd"/>
+            <w:r>
+              <w:rPr>
+                <w:b/>
+              </w:rPr>
+              <w:t xml:space="preserve"> </w:t>
             </w:r>
             <w:r>
               <w:t xml:space="preserve">Admin </w:t>
@@ -14670,11 +15180,19 @@
             <w:pPr>
               <w:spacing w:line="360" w:lineRule="auto"/>
             </w:pPr>
+            <w:proofErr w:type="gramStart"/>
             <w:r>
               <w:rPr>
                 <w:b/>
               </w:rPr>
-              <w:t xml:space="preserve">Trigger : </w:t>
+              <w:t>Trigger :</w:t>
+            </w:r>
+            <w:proofErr w:type="gramEnd"/>
+            <w:r>
+              <w:rPr>
+                <w:b/>
+              </w:rPr>
+              <w:t xml:space="preserve"> </w:t>
             </w:r>
             <w:r>
               <w:t xml:space="preserve">Admin </w:t>
@@ -14716,14 +15234,38 @@
             <w:pPr>
               <w:spacing w:line="360" w:lineRule="auto"/>
             </w:pPr>
+            <w:proofErr w:type="gramStart"/>
             <w:r>
               <w:rPr>
                 <w:b/>
               </w:rPr>
-              <w:t xml:space="preserve">Type : </w:t>
-            </w:r>
-            <w:r>
-              <w:t>[ X ] External || [  ]Temporal</w:t>
+              <w:t>Type :</w:t>
+            </w:r>
+            <w:proofErr w:type="gramEnd"/>
+            <w:r>
+              <w:rPr>
+                <w:b/>
+              </w:rPr>
+              <w:t xml:space="preserve"> </w:t>
+            </w:r>
+            <w:r>
+              <w:t xml:space="preserve">[ </w:t>
+            </w:r>
+            <w:proofErr w:type="gramStart"/>
+            <w:r>
+              <w:t>X ]</w:t>
+            </w:r>
+            <w:proofErr w:type="gramEnd"/>
+            <w:r>
+              <w:t xml:space="preserve"> External || </w:t>
+            </w:r>
+            <w:proofErr w:type="gramStart"/>
+            <w:r>
+              <w:t>[  ]</w:t>
+            </w:r>
+            <w:proofErr w:type="gramEnd"/>
+            <w:r>
+              <w:t>Temporal</w:t>
             </w:r>
           </w:p>
         </w:tc>
@@ -14738,11 +15280,19 @@
             <w:pPr>
               <w:spacing w:line="360" w:lineRule="auto"/>
             </w:pPr>
+            <w:proofErr w:type="gramStart"/>
             <w:r>
               <w:rPr>
                 <w:b/>
               </w:rPr>
-              <w:t xml:space="preserve">Preconditions : </w:t>
+              <w:t>Preconditions :</w:t>
+            </w:r>
+            <w:proofErr w:type="gramEnd"/>
+            <w:r>
+              <w:rPr>
+                <w:b/>
+              </w:rPr>
+              <w:t xml:space="preserve"> </w:t>
             </w:r>
             <w:r>
               <w:br/>
@@ -14773,7 +15323,21 @@
               <w:rPr>
                 <w:b/>
               </w:rPr>
-              <w:t xml:space="preserve">Normal Course : </w:t>
+              <w:t xml:space="preserve">Normal </w:t>
+            </w:r>
+            <w:proofErr w:type="gramStart"/>
+            <w:r>
+              <w:rPr>
+                <w:b/>
+              </w:rPr>
+              <w:t>Course :</w:t>
+            </w:r>
+            <w:proofErr w:type="gramEnd"/>
+            <w:r>
+              <w:rPr>
+                <w:b/>
+              </w:rPr>
+              <w:t xml:space="preserve"> </w:t>
             </w:r>
             <w:r>
               <w:br/>
@@ -15004,12 +15568,20 @@
             <w:pPr>
               <w:spacing w:line="360" w:lineRule="auto"/>
             </w:pPr>
+            <w:proofErr w:type="gramStart"/>
             <w:r>
               <w:rPr>
                 <w:b/>
               </w:rPr>
               <w:lastRenderedPageBreak/>
-              <w:t xml:space="preserve">Postconditions : </w:t>
+              <w:t>Postconditions :</w:t>
+            </w:r>
+            <w:proofErr w:type="gramEnd"/>
+            <w:r>
+              <w:rPr>
+                <w:b/>
+              </w:rPr>
+              <w:t xml:space="preserve"> </w:t>
             </w:r>
             <w:r>
               <w:br/>
@@ -15068,11 +15640,19 @@
             <w:pPr>
               <w:spacing w:line="360" w:lineRule="auto"/>
             </w:pPr>
+            <w:proofErr w:type="gramStart"/>
             <w:r>
               <w:rPr>
                 <w:b/>
               </w:rPr>
-              <w:t xml:space="preserve">Exceptions : </w:t>
+              <w:t>Exceptions :</w:t>
+            </w:r>
+            <w:proofErr w:type="gramEnd"/>
+            <w:r>
+              <w:rPr>
+                <w:b/>
+              </w:rPr>
+              <w:t xml:space="preserve"> </w:t>
             </w:r>
             <w:r>
               <w:br/>
@@ -15338,6 +15918,7 @@
       </w:pPr>
       <w:r>
         <w:rPr>
+          <w:noProof/>
           <w:lang w:val="en-ID"/>
         </w:rPr>
         <w:drawing>
@@ -15495,6 +16076,7 @@
       </w:pPr>
       <w:r>
         <w:rPr>
+          <w:noProof/>
           <w:lang w:val="en-ID"/>
         </w:rPr>
         <w:drawing>
@@ -15632,6 +16214,7 @@
       </w:pPr>
       <w:r>
         <w:rPr>
+          <w:noProof/>
           <w:lang w:val="en-ID"/>
         </w:rPr>
         <w:drawing>
@@ -15697,6 +16280,7 @@
       </w:pPr>
       <w:bookmarkStart w:id="36" w:name="_Toc439994690"/>
       <w:bookmarkStart w:id="37" w:name="_Toc485163119"/>
+      <w:proofErr w:type="gramStart"/>
       <w:r>
         <w:rPr>
           <w:rFonts w:ascii="Times New Roman" w:hAnsi="Times New Roman"/>
@@ -15720,7 +16304,16 @@
           <w:sz w:val="24"/>
           <w:szCs w:val="24"/>
         </w:rPr>
-        <w:t>unctional Requirements</w:t>
+        <w:t>unctional</w:t>
+      </w:r>
+      <w:proofErr w:type="gramEnd"/>
+      <w:r>
+        <w:rPr>
+          <w:rFonts w:ascii="Times New Roman" w:hAnsi="Times New Roman"/>
+          <w:sz w:val="24"/>
+          <w:szCs w:val="24"/>
+        </w:rPr>
+        <w:t xml:space="preserve"> Requirements</w:t>
       </w:r>
       <w:bookmarkEnd w:id="36"/>
       <w:bookmarkEnd w:id="37"/>
@@ -17551,6 +18144,7 @@
               <w:t xml:space="preserve"> internet yang </w:t>
             </w:r>
             <w:proofErr w:type="spellStart"/>
+            <w:proofErr w:type="gramStart"/>
             <w:r>
               <w:rPr>
                 <w:i w:val="0"/>
@@ -17571,6 +18165,7 @@
               <w:t>.&lt;</w:t>
             </w:r>
             <w:proofErr w:type="spellStart"/>
+            <w:proofErr w:type="gramEnd"/>
             <w:r>
               <w:rPr>
                 <w:i w:val="0"/>
@@ -18553,6 +19148,7 @@
               </w:rPr>
               <w:t> </w:t>
             </w:r>
+            <w:proofErr w:type="gramStart"/>
             <w:r>
               <w:rPr>
                 <w:b/>
@@ -18574,6 +19170,7 @@
               <w:t>.&lt;</w:t>
             </w:r>
             <w:proofErr w:type="spellStart"/>
+            <w:proofErr w:type="gramEnd"/>
             <w:r>
               <w:rPr>
                 <w:i w:val="0"/>
@@ -18691,9 +19288,20 @@
                 <w:szCs w:val="24"/>
                 <w:lang w:val="en-ID"/>
               </w:rPr>
-              <w:t xml:space="preserve"> format hash dan salted di database.&lt;</w:t>
-            </w:r>
-            <w:proofErr w:type="spellStart"/>
+              <w:t xml:space="preserve"> format hash dan salted di </w:t>
+            </w:r>
+            <w:proofErr w:type="gramStart"/>
+            <w:r>
+              <w:rPr>
+                <w:i w:val="0"/>
+                <w:sz w:val="24"/>
+                <w:szCs w:val="24"/>
+                <w:lang w:val="en-ID"/>
+              </w:rPr>
+              <w:t>database.&lt;</w:t>
+            </w:r>
+            <w:proofErr w:type="spellStart"/>
+            <w:proofErr w:type="gramEnd"/>
             <w:r>
               <w:rPr>
                 <w:i w:val="0"/>
@@ -18954,6 +19562,7 @@
               <w:t xml:space="preserve"> </w:t>
             </w:r>
             <w:proofErr w:type="spellStart"/>
+            <w:proofErr w:type="gramStart"/>
             <w:r>
               <w:rPr>
                 <w:i w:val="0"/>
@@ -18974,6 +19583,7 @@
               <w:t>.&lt;</w:t>
             </w:r>
             <w:proofErr w:type="spellStart"/>
+            <w:proofErr w:type="gramEnd"/>
             <w:r>
               <w:rPr>
                 <w:i w:val="0"/>
@@ -19435,6 +20045,7 @@
         </w:rPr>
       </w:pPr>
       <w:proofErr w:type="spellStart"/>
+      <w:proofErr w:type="gramStart"/>
       <w:r>
         <w:rPr>
           <w:i w:val="0"/>
@@ -19452,6 +20063,7 @@
         </w:rPr>
         <w:t xml:space="preserve"> :</w:t>
       </w:r>
+      <w:proofErr w:type="gramEnd"/>
     </w:p>
     <w:p>
       <w:pPr>
@@ -19739,7 +20351,23 @@
           <w:rFonts w:ascii="Times New Roman" w:hAnsi="Times New Roman"/>
           <w:szCs w:val="24"/>
         </w:rPr>
-        <w:t xml:space="preserve">Response time : Batasan </w:t>
+        <w:t xml:space="preserve">Response </w:t>
+      </w:r>
+      <w:proofErr w:type="gramStart"/>
+      <w:r>
+        <w:rPr>
+          <w:rFonts w:ascii="Times New Roman" w:hAnsi="Times New Roman"/>
+          <w:szCs w:val="24"/>
+        </w:rPr>
+        <w:t>time :</w:t>
+      </w:r>
+      <w:proofErr w:type="gramEnd"/>
+      <w:r>
+        <w:rPr>
+          <w:rFonts w:ascii="Times New Roman" w:hAnsi="Times New Roman"/>
+          <w:szCs w:val="24"/>
+        </w:rPr>
+        <w:t xml:space="preserve"> Batasan </w:t>
       </w:r>
       <w:proofErr w:type="spellStart"/>
       <w:r>
@@ -20154,12 +20782,21 @@
           <w:szCs w:val="24"/>
         </w:rPr>
       </w:pPr>
-      <w:r>
-        <w:rPr>
-          <w:rFonts w:ascii="Times New Roman" w:hAnsi="Times New Roman"/>
-          <w:szCs w:val="24"/>
-        </w:rPr>
-        <w:t xml:space="preserve">Security : </w:t>
+      <w:proofErr w:type="gramStart"/>
+      <w:r>
+        <w:rPr>
+          <w:rFonts w:ascii="Times New Roman" w:hAnsi="Times New Roman"/>
+          <w:szCs w:val="24"/>
+        </w:rPr>
+        <w:t>Security :</w:t>
+      </w:r>
+      <w:proofErr w:type="gramEnd"/>
+      <w:r>
+        <w:rPr>
+          <w:rFonts w:ascii="Times New Roman" w:hAnsi="Times New Roman"/>
+          <w:szCs w:val="24"/>
+        </w:rPr>
+        <w:t xml:space="preserve"> </w:t>
       </w:r>
       <w:proofErr w:type="spellStart"/>
       <w:r>
@@ -24101,6 +24738,7 @@
   <w:style w:type="character" w:default="1" w:styleId="DefaultParagraphFont">
     <w:name w:val="Default Paragraph Font"/>
     <w:uiPriority w:val="1"/>
+    <w:semiHidden/>
     <w:unhideWhenUsed/>
   </w:style>
   <w:style w:type="table" w:default="1" w:styleId="TableNormal">

</xml_diff>